<commit_message>
Plan: merge the fast-ADC review and the OpenVector Bench review into the feature plan
Adds a dated addendum to docs/notes/turboquant-pro_feature-requests.docx; the
original text is unchanged. The scorer becomes part of every feature that names
a reader (#173, #175, #177, #178, #182, #174), the review's 1M experiment and
the OVB stage decomposition become one preregistered measurement that also
feeds #175 phase 2, #176 phase 3 and #181, and the 10^12 result is placed in
OVB as systems evidence with its realism caveat kept.

Co-Authored-By: Claude Opus 5.5 (1M context) <noreply@anthropic.com>
</commit_message>
<xml_diff>
--- a/docs/notes/turboquant-pro_feature-requests.docx
+++ b/docs/notes/turboquant-pro_feature-requests.docx
@@ -2217,6 +2217,966 @@
       </w:r>
     </w:p>
     <w:p/>
+    <w:p>
+      <w:r>
+        <w:br w:type="page"/>
+      </w:r>
+    </w:p>
+    <w:p>
+      <w:pPr>
+        <w:pStyle w:val="Heading1"/>
+      </w:pPr>
+      <w:r>
+        <w:t>Addendum, 2026-09-29: two reviews merged into this plan</w:t>
+      </w:r>
+    </w:p>
+    <w:p>
+      <w:r>
+        <w:t>Two reviews arrived on 2026-09-29. The first is about the fast ADC kernel and asks for three things: one contract in the docs, scorer identity in the API, and a 1M systems experiment. The second places the 10^12 recall result inside OpenVector Bench (OVB). This addendum folds both into the plan above (issues #173 to #182, umbrella #183) instead of running them as separate tracks, because each one touches features that are already here. The text above this page is unchanged.</w:t>
+      </w:r>
+    </w:p>
+    <w:p>
+      <w:pPr>
+        <w:pStyle w:val="Heading2"/>
+      </w:pPr>
+      <w:r>
+        <w:t>1. What the reviews asked, and where each item stands</w:t>
+      </w:r>
+    </w:p>
+    <w:tbl>
+      <w:tblPr>
+        <w:tblW w:type="auto" w:w="0"/>
+        <w:tblLook w:firstColumn="1" w:firstRow="1" w:lastColumn="0" w:lastRow="0" w:noHBand="0" w:noVBand="1" w:val="04A0"/>
+        <w:tblBorders>
+          <w:top w:val="single" w:sz="4" w:color="999999"/>
+          <w:left w:val="single" w:sz="4" w:color="999999"/>
+          <w:bottom w:val="single" w:sz="4" w:color="999999"/>
+          <w:right w:val="single" w:sz="4" w:color="999999"/>
+          <w:insideH w:val="single" w:sz="4" w:color="999999"/>
+          <w:insideV w:val="single" w:sz="4" w:color="999999"/>
+        </w:tblBorders>
+      </w:tblPr>
+      <w:tblGrid>
+        <w:gridCol w:w="3120"/>
+        <w:gridCol w:w="3120"/>
+        <w:gridCol w:w="3120"/>
+      </w:tblGrid>
+      <w:tr>
+        <w:trPr>
+          <w:tblHeader w:val="true"/>
+          <w:cantSplit w:val="true"/>
+        </w:trPr>
+        <w:tc>
+          <w:tcPr>
+            <w:tcW w:type="dxa" w:w="3120"/>
+          </w:tcPr>
+          <w:p>
+            <w:r/>
+            <w:r>
+              <w:rPr>
+                <w:b/>
+              </w:rPr>
+              <w:t>Item</w:t>
+            </w:r>
+          </w:p>
+        </w:tc>
+        <w:tc>
+          <w:tcPr>
+            <w:tcW w:type="dxa" w:w="3120"/>
+          </w:tcPr>
+          <w:p>
+            <w:r/>
+            <w:r>
+              <w:rPr>
+                <w:b/>
+              </w:rPr>
+              <w:t>Status on 2026-09-29</w:t>
+            </w:r>
+          </w:p>
+        </w:tc>
+        <w:tc>
+          <w:tcPr>
+            <w:tcW w:type="dxa" w:w="3120"/>
+          </w:tcPr>
+          <w:p>
+            <w:r/>
+            <w:r>
+              <w:rPr>
+                <w:b/>
+              </w:rPr>
+              <w:t>Lands in</w:t>
+            </w:r>
+          </w:p>
+        </w:tc>
+      </w:tr>
+      <w:tr>
+        <w:tc>
+          <w:tcPr>
+            <w:tcW w:type="dxa" w:w="3120"/>
+          </w:tcPr>
+          <w:p>
+            <w:r>
+              <w:t>One contract across the docs: exact ADC, SIMD ADC, SIMD plus exact rerank</w:t>
+            </w:r>
+          </w:p>
+        </w:tc>
+        <w:tc>
+          <w:tcPr>
+            <w:tcW w:type="dxa" w:w="3120"/>
+          </w:tcPr>
+          <w:p>
+            <w:r>
+              <w:t>Done in PR #274 (CI green, not merged)</w:t>
+            </w:r>
+          </w:p>
+        </w:tc>
+        <w:tc>
+          <w:tcPr>
+            <w:tcW w:type="dxa" w:w="3120"/>
+          </w:tcPr>
+          <w:p>
+            <w:r>
+              <w:t>DESIGN_fast_adc.md, 'The contract, in one place'</w:t>
+            </w:r>
+          </w:p>
+        </w:tc>
+      </w:tr>
+      <w:tr>
+        <w:tc>
+          <w:tcPr>
+            <w:tcW w:type="dxa" w:w="3120"/>
+          </w:tcPr>
+          <w:p>
+            <w:r>
+              <w:t>State the 100k result as an operating point, not 'the trilemma is broken'</w:t>
+            </w:r>
+          </w:p>
+        </w:tc>
+        <w:tc>
+          <w:tcPr>
+            <w:tcW w:type="dxa" w:w="3120"/>
+          </w:tcPr>
+          <w:p>
+            <w:r>
+              <w:t>Done in PR #274</w:t>
+            </w:r>
+          </w:p>
+        </w:tc>
+        <w:tc>
+          <w:tcPr>
+            <w:tcW w:type="dxa" w:w="3120"/>
+          </w:tcPr>
+          <w:p>
+            <w:r>
+              <w:t>DESIGN_fast_adc.md M3-final, COMPREHENSIVE_ANALYSIS.md</w:t>
+            </w:r>
+          </w:p>
+        </w:tc>
+      </w:tr>
+      <w:tr>
+        <w:tc>
+          <w:tcPr>
+            <w:tcW w:type="dxa" w:w="3120"/>
+          </w:tcPr>
+          <w:p>
+            <w:r>
+              <w:t>Scorer identity first-class: mode='exact'|'fast', provenance on results</w:t>
+            </w:r>
+          </w:p>
+        </w:tc>
+        <w:tc>
+          <w:tcPr>
+            <w:tcW w:type="dxa" w:w="3120"/>
+          </w:tcPr>
+          <w:p>
+            <w:r>
+              <w:t>Search side done in PR #274. Open: bind policies and certificates to the scorer; scorer provenance in benchmark artifacts</w:t>
+            </w:r>
+          </w:p>
+        </w:tc>
+        <w:tc>
+          <w:tcPr>
+            <w:tcW w:type="dxa" w:w="3120"/>
+          </w:tcPr>
+          <w:p>
+            <w:r>
+              <w:t>#175, #177, #173, benchmarks</w:t>
+            </w:r>
+          </w:p>
+        </w:tc>
+      </w:tr>
+      <w:tr>
+        <w:tc>
+          <w:tcPr>
+            <w:tcW w:type="dxa" w:w="3120"/>
+          </w:tcPr>
+          <w:p>
+            <w:r>
+              <w:t>1M kernel experiment: QPS, latency distribution, rerank width and cost, total bytes, five systems on identical hardware</w:t>
+            </w:r>
+          </w:p>
+        </w:tc>
+        <w:tc>
+          <w:tcPr>
+            <w:tcW w:type="dxa" w:w="3120"/>
+          </w:tcPr>
+          <w:p>
+            <w:r>
+              <w:t>Not started. Merged into the stage-decomposed measurement (section 4)</w:t>
+            </w:r>
+          </w:p>
+        </w:tc>
+        <w:tc>
+          <w:tcPr>
+            <w:tcW w:type="dxa" w:w="3120"/>
+          </w:tcPr>
+          <w:p>
+            <w:r>
+              <w:t>#172, #174, #175, #176, #181, OVB</w:t>
+            </w:r>
+          </w:p>
+        </w:tc>
+      </w:tr>
+      <w:tr>
+        <w:tc>
+          <w:tcPr>
+            <w:tcW w:type="dxa" w:w="3120"/>
+          </w:tcPr>
+          <w:p>
+            <w:r>
+              <w:t>Place 10^12 inside OVB; keep the realism caveat; report recall by stage</w:t>
+            </w:r>
+          </w:p>
+        </w:tc>
+        <w:tc>
+          <w:tcPr>
+            <w:tcW w:type="dxa" w:w="3120"/>
+          </w:tcPr>
+          <w:p>
+            <w:r>
+              <w:t>Not started (section 3)</w:t>
+            </w:r>
+          </w:p>
+        </w:tc>
+        <w:tc>
+          <w:tcPr>
+            <w:tcW w:type="dxa" w:w="3120"/>
+          </w:tcPr>
+          <w:p>
+            <w:r>
+              <w:t>OVB README, the measurement in section 4</w:t>
+            </w:r>
+          </w:p>
+        </w:tc>
+      </w:tr>
+    </w:tbl>
+    <w:p/>
+    <w:p>
+      <w:pPr>
+        <w:pStyle w:val="Heading2"/>
+      </w:pPr>
+      <w:r>
+        <w:t>2. The scorer is an observer, so every feature that names a reader names it</w:t>
+      </w:r>
+    </w:p>
+    <w:p>
+      <w:r>
+        <w:t>The first review's layering is the same shape as this plan. The exact scorer is the reference semantics. The SIMD scorer is a bounded-resolution approximation. The rerank reconciles the boundary region. A certificate is anchored to named semantics. In this plan: a contract names the reader, a certificate states when it is valid, and adaptive refinement spends observation only where the margin is not decisive. The SIMD kernel is itself a reader of the codes, with a stated resolution (255 levels of one query-global scale; every score within 5% of the top-k spread, tested). So each feature that names a reader must also name the scorer.</w:t>
+      </w:r>
+    </w:p>
+    <w:p>
+      <w:pPr>
+        <w:pStyle w:val="ListParagraph"/>
+      </w:pPr>
+      <w:r>
+        <w:t xml:space="preserve">• </w:t>
+      </w:r>
+      <w:r>
+        <w:rPr>
+          <w:b/>
+        </w:rPr>
+        <w:t>#173 Observer Contracts.</w:t>
+      </w:r>
+      <w:r>
+        <w:t xml:space="preserve"> A consumer entry may declare scorer: exact | fast. Claim replay and certificate anchors require exact. The default stays fast.</w:t>
+      </w:r>
+    </w:p>
+    <w:p>
+      <w:pPr>
+        <w:pStyle w:val="ListParagraph"/>
+      </w:pPr>
+      <w:r>
+        <w:t xml:space="preserve">• </w:t>
+      </w:r>
+      <w:r>
+        <w:rPr>
+          <w:b/>
+        </w:rPr>
+        <w:t>#175 Adaptive refinement.</w:t>
+      </w:r>
+      <w:r>
+        <w:t xml:space="preserve"> Finding: the policy fingerprint drops the index's kernel flag, so a band calibrated on SIMD scores is accepted on an install that scans with the exact scorer, and the reverse. The conformal guarantee is calibrated on one scorer's score distribution and does not transfer. Fix: bind the policy to the first-stage scorer (name, kernel version, table) and refuse a mismatch with the reason. Small; first in the queue. The phase-3 middle stage (base plus layer) is another scorer and gets its own name.</w:t>
+      </w:r>
+    </w:p>
+    <w:p>
+      <w:pPr>
+        <w:pStyle w:val="ListParagraph"/>
+      </w:pPr>
+      <w:r>
+        <w:t xml:space="preserve">• </w:t>
+      </w:r>
+      <w:r>
+        <w:rPr>
+          <w:b/>
+        </w:rPr>
+        <w:t>#177 Certificates expire.</w:t>
+      </w:r>
+      <w:r>
+        <w:t xml:space="preserve"> A change of first-stage scorer (fast to exact, a kernel version, the table's levels) is a change of observer. Add it as a validity check: STALE, reason 'first-stage scorer changed', action RECERTIFY.</w:t>
+      </w:r>
+    </w:p>
+    <w:p>
+      <w:pPr>
+        <w:pStyle w:val="ListParagraph"/>
+      </w:pPr>
+      <w:r>
+        <w:t xml:space="preserve">• </w:t>
+      </w:r>
+      <w:r>
+        <w:rPr>
+          <w:b/>
+        </w:rPr>
+        <w:t>#178 Capability discovery.</w:t>
+      </w:r>
+      <w:r>
+        <w:t xml:space="preserve"> Each certified capability states the scorer it holds under, for example 'cosine top-10 retrieval, SIMD plus exact rerank'.</w:t>
+      </w:r>
+    </w:p>
+    <w:p>
+      <w:pPr>
+        <w:pStyle w:val="ListParagraph"/>
+      </w:pPr>
+      <w:r>
+        <w:t xml:space="preserve">• </w:t>
+      </w:r>
+      <w:r>
+        <w:rPr>
+          <w:b/>
+        </w:rPr>
+        <w:t>#182 Pipeline composition.</w:t>
+      </w:r>
+      <w:r>
+        <w:t xml:space="preserve"> The SIMD scan and the rerank are two stages of the chain. The kernel's tested resolution bound is that stage's distortion term.</w:t>
+      </w:r>
+    </w:p>
+    <w:p>
+      <w:pPr>
+        <w:pStyle w:val="ListParagraph"/>
+      </w:pPr>
+      <w:r>
+        <w:t xml:space="preserve">• </w:t>
+      </w:r>
+      <w:r>
+        <w:rPr>
+          <w:b/>
+        </w:rPr>
+        <w:t>#174 Progressive codes.</w:t>
+      </w:r>
+      <w:r>
+        <w:t xml:space="preserve"> The layered reader is 'bit-exact with a flat index at the same total widths' only under one scorer. The phase-2 test states which.</w:t>
+      </w:r>
+    </w:p>
+    <w:p>
+      <w:pPr>
+        <w:pStyle w:val="Heading2"/>
+      </w:pPr>
+      <w:r>
+        <w:t>3. OpenVector Bench: recall is a composition of stages</w:t>
+      </w:r>
+    </w:p>
+    <w:p>
+      <w:r>
+        <w:t>OVB separates three truth layers (L1 geometric, L2 structural, L3 human) and nests its tiers so that only N changes between them. The TurboQuant Pro measurements already factor the L1 side into stages, each against a named reference:</w:t>
+      </w:r>
+    </w:p>
+    <w:tbl>
+      <w:tblPr>
+        <w:tblW w:type="auto" w:w="0"/>
+        <w:tblLook w:firstColumn="1" w:firstRow="1" w:lastColumn="0" w:lastRow="0" w:noHBand="0" w:noVBand="1" w:val="04A0"/>
+        <w:tblBorders>
+          <w:top w:val="single" w:sz="4" w:color="999999"/>
+          <w:left w:val="single" w:sz="4" w:color="999999"/>
+          <w:bottom w:val="single" w:sz="4" w:color="999999"/>
+          <w:right w:val="single" w:sz="4" w:color="999999"/>
+          <w:insideH w:val="single" w:sz="4" w:color="999999"/>
+          <w:insideV w:val="single" w:sz="4" w:color="999999"/>
+        </w:tblBorders>
+      </w:tblPr>
+      <w:tblGrid>
+        <w:gridCol w:w="2340"/>
+        <w:gridCol w:w="2340"/>
+        <w:gridCol w:w="2340"/>
+        <w:gridCol w:w="2340"/>
+      </w:tblGrid>
+      <w:tr>
+        <w:trPr>
+          <w:tblHeader w:val="true"/>
+          <w:cantSplit w:val="true"/>
+        </w:trPr>
+        <w:tc>
+          <w:tcPr>
+            <w:tcW w:type="dxa" w:w="2340"/>
+          </w:tcPr>
+          <w:p>
+            <w:r/>
+            <w:r>
+              <w:rPr>
+                <w:b/>
+              </w:rPr>
+              <w:t>Stage</w:t>
+            </w:r>
+          </w:p>
+        </w:tc>
+        <w:tc>
+          <w:tcPr>
+            <w:tcW w:type="dxa" w:w="2340"/>
+          </w:tcPr>
+          <w:p>
+            <w:r/>
+            <w:r>
+              <w:rPr>
+                <w:b/>
+              </w:rPr>
+              <w:t>Measured against</w:t>
+            </w:r>
+          </w:p>
+        </w:tc>
+        <w:tc>
+          <w:tcPr>
+            <w:tcW w:type="dxa" w:w="2340"/>
+          </w:tcPr>
+          <w:p>
+            <w:r/>
+            <w:r>
+              <w:rPr>
+                <w:b/>
+              </w:rPr>
+              <w:t>What we have</w:t>
+            </w:r>
+          </w:p>
+        </w:tc>
+        <w:tc>
+          <w:tcPr>
+            <w:tcW w:type="dxa" w:w="2340"/>
+          </w:tcPr>
+          <w:p>
+            <w:r/>
+            <w:r>
+              <w:rPr>
+                <w:b/>
+              </w:rPr>
+              <w:t>Where</w:t>
+            </w:r>
+          </w:p>
+        </w:tc>
+      </w:tr>
+      <w:tr>
+        <w:tc>
+          <w:tcPr>
+            <w:tcW w:type="dxa" w:w="2340"/>
+          </w:tcPr>
+          <w:p>
+            <w:r>
+              <w:t>Routing (IVF)</w:t>
+            </w:r>
+          </w:p>
+        </w:tc>
+        <w:tc>
+          <w:tcPr>
+            <w:tcW w:type="dxa" w:w="2340"/>
+          </w:tcPr>
+          <w:p>
+            <w:r>
+              <w:t>the compressed exact scan</w:t>
+            </w:r>
+          </w:p>
+        </w:tc>
+        <w:tc>
+          <w:tcPr>
+            <w:tcW w:type="dxa" w:w="2340"/>
+          </w:tcPr>
+          <w:p>
+            <w:r>
+              <w:t>flat from 20M to 10^12 rows: 0.989 at nprobe 32, 0.999 at nprobe 128; the probe sweep 16/64/256 (0.952/0.997/1.000) equals the cell-rank prediction</w:t>
+            </w:r>
+          </w:p>
+        </w:tc>
+        <w:tc>
+          <w:tcPr>
+            <w:tcW w:type="dxa" w:w="2340"/>
+          </w:tcPr>
+          <w:p>
+            <w:r>
+              <w:t>1T_RECALL_RESULT_2026-09-27.md</w:t>
+            </w:r>
+          </w:p>
+        </w:tc>
+      </w:tr>
+      <w:tr>
+        <w:tc>
+          <w:tcPr>
+            <w:tcW w:type="dxa" w:w="2340"/>
+          </w:tcPr>
+          <w:p>
+            <w:r>
+              <w:t>Scoring (SIMD against exact ADC)</w:t>
+            </w:r>
+          </w:p>
+        </w:tc>
+        <w:tc>
+          <w:tcPr>
+            <w:tcW w:type="dxa" w:w="2340"/>
+          </w:tcPr>
+          <w:p>
+            <w:r>
+              <w:t>the exact ADC</w:t>
+            </w:r>
+          </w:p>
+        </w:tc>
+        <w:tc>
+          <w:tcPr>
+            <w:tcW w:type="dxa" w:w="2340"/>
+          </w:tcPr>
+          <w:p>
+            <w:r>
+              <w:t>top-10 agreement 0.9775 at 100k LaBSE; within 5% of the top-k spread in tests</w:t>
+            </w:r>
+          </w:p>
+        </w:tc>
+        <w:tc>
+          <w:tcPr>
+            <w:tcW w:type="dxa" w:w="2340"/>
+          </w:tcPr>
+          <w:p>
+            <w:r>
+              <w:t>DESIGN_fast_adc.md section 3b</w:t>
+            </w:r>
+          </w:p>
+        </w:tc>
+      </w:tr>
+      <w:tr>
+        <w:tc>
+          <w:tcPr>
+            <w:tcW w:type="dxa" w:w="2340"/>
+          </w:tcPr>
+          <w:p>
+            <w:r>
+              <w:t>Representation (codes against fp32)</w:t>
+            </w:r>
+          </w:p>
+        </w:tc>
+        <w:tc>
+          <w:tcPr>
+            <w:tcW w:type="dxa" w:w="2340"/>
+          </w:tcPr>
+          <w:p>
+            <w:r>
+              <w:t>fp32 exact k-NN (OVB L1)</w:t>
+            </w:r>
+          </w:p>
+        </w:tc>
+        <w:tc>
+          <w:tcPr>
+            <w:tcW w:type="dxa" w:w="2340"/>
+          </w:tcPr>
+          <w:p>
+            <w:r>
+              <w:t>0.592 at 10^9 before rerank, against 0.999 for the index's own ranking</w:t>
+            </w:r>
+          </w:p>
+        </w:tc>
+        <w:tc>
+          <w:tcPr>
+            <w:tcW w:type="dxa" w:w="2340"/>
+          </w:tcPr>
+          <w:p>
+            <w:r>
+              <w:t>OVB README, 'Why'</w:t>
+            </w:r>
+          </w:p>
+        </w:tc>
+      </w:tr>
+      <w:tr>
+        <w:tc>
+          <w:tcPr>
+            <w:tcW w:type="dxa" w:w="2340"/>
+          </w:tcPr>
+          <w:p>
+            <w:r>
+              <w:t>Rerank</w:t>
+            </w:r>
+          </w:p>
+        </w:tc>
+        <w:tc>
+          <w:tcPr>
+            <w:tcW w:type="dxa" w:w="2340"/>
+          </w:tcPr>
+          <w:p>
+            <w:r>
+              <w:t>fp32 exact k-NN</w:t>
+            </w:r>
+          </w:p>
+        </w:tc>
+        <w:tc>
+          <w:tcPr>
+            <w:tcW w:type="dxa" w:w="2340"/>
+          </w:tcPr>
+          <w:p>
+            <w:r>
+              <w:t>0.9995 at 100k LaBSE (the two-stage path)</w:t>
+            </w:r>
+          </w:p>
+        </w:tc>
+        <w:tc>
+          <w:tcPr>
+            <w:tcW w:type="dxa" w:w="2340"/>
+          </w:tcPr>
+          <w:p>
+            <w:r>
+              <w:t>DESIGN_fast_adc.md M3-final</w:t>
+            </w:r>
+          </w:p>
+        </w:tc>
+      </w:tr>
+      <w:tr>
+        <w:tc>
+          <w:tcPr>
+            <w:tcW w:type="dxa" w:w="2340"/>
+          </w:tcPr>
+          <w:p>
+            <w:r>
+              <w:t>Relevance</w:t>
+            </w:r>
+          </w:p>
+        </w:tc>
+        <w:tc>
+          <w:tcPr>
+            <w:tcW w:type="dxa" w:w="2340"/>
+          </w:tcPr>
+          <w:p>
+            <w:r>
+              <w:t>OVB L2 and L3</w:t>
+            </w:r>
+          </w:p>
+        </w:tc>
+        <w:tc>
+          <w:tcPr>
+            <w:tcW w:type="dxa" w:w="2340"/>
+          </w:tcPr>
+          <w:p>
+            <w:r>
+              <w:t>not measured</w:t>
+            </w:r>
+          </w:p>
+        </w:tc>
+        <w:tc>
+          <w:tcPr>
+            <w:tcW w:type="dxa" w:w="2340"/>
+          </w:tcPr>
+          <w:p>
+            <w:r>
+              <w:t>OVB truth layers</w:t>
+            </w:r>
+          </w:p>
+        </w:tc>
+      </w:tr>
+    </w:tbl>
+    <w:p/>
+    <w:p>
+      <w:r>
+        <w:t>What this separates, and what it does not. The distribution machinery works to 10^12. Routing fidelity against the compressed scan is flat in N on this corpus family. Representation fidelity is measurably imperfect. Synthetic-to-real transfer of ANN difficulty is not established: OVB's open IVF study found real data needs nprobe 47 to 50 for 95% recall where the generator needs 2 (R80_ANN), and RC-1 rejects the low-rank class the fleet corpus belongs to. So the 10^12 result is systems evidence and an instrument calibration at extreme scale. It is not an OVB tier, and its caveat stays. 'Scale does not collapse routing' holds for this controlled family only.</w:t>
+      </w:r>
+    </w:p>
+    <w:p>
+      <w:r>
+        <w:t>The testable link between the two repos. The cell-rank prediction reproduced the 10^12 probe curve exactly, and it needs only the index and the reference neighbours' cell ranks, not a model of the corpus. If it also predicts the real corpus's probe depth on OVB's real tiers below the seam, then the 25x divergence lives in where each query's true neighbours fall among the cells: a query-corpus relationship, which is where OVB's R107 replication located the query-side signal. If it fails there, routing on real data has a component the cell ranks miss. Either outcome is informative, and it can be registered before it is run.</w:t>
+      </w:r>
+    </w:p>
+    <w:p>
+      <w:pPr>
+        <w:pStyle w:val="Heading2"/>
+      </w:pPr>
+      <w:r>
+        <w:t>4. One registered measurement instead of four</w:t>
+      </w:r>
+    </w:p>
+    <w:p>
+      <w:r>
+        <w:t>Several open phases are waiting on measurements on public data: #175 phase 2 (rows and bytes read, mean and p99, against fixed rerank=5), #174 phase 3 (layered reader against flat, measured tax), #176 phase 3 (predicted payload against the planner's choice), and #181, which is blocked until a scan rate and a fetch latency are measured on named hardware. The first review's 1M experiment asks for that kind of run. The second review asks that recall be reported by stage and truth layer. One preregistered measurement serves all of them:</w:t>
+      </w:r>
+    </w:p>
+    <w:p>
+      <w:pPr>
+        <w:pStyle w:val="ListParagraph"/>
+      </w:pPr>
+      <w:r>
+        <w:t xml:space="preserve">• </w:t>
+      </w:r>
+      <w:r>
+        <w:rPr>
+          <w:b/>
+        </w:rPr>
+        <w:t>Corpora:</w:t>
+      </w:r>
+      <w:r>
+        <w:t xml:space="preserve"> OVB's real tiers below the seam, where L1 ground truth and per-query difficulty strata are published, plus the existing campaign arms (benchmarks/rabitq_public: DBpedia ada-002 1M, DBpedia text-embedding-3-large 1M, Wikipedia-1024 10M).</w:t>
+      </w:r>
+    </w:p>
+    <w:p>
+      <w:pPr>
+        <w:pStyle w:val="ListParagraph"/>
+      </w:pPr>
+      <w:r>
+        <w:t xml:space="preserve">• </w:t>
+      </w:r>
+      <w:r>
+        <w:rPr>
+          <w:b/>
+        </w:rPr>
+        <w:t>Systems:</w:t>
+      </w:r>
+      <w:r>
+        <w:t xml:space="preserve"> TurboQuant Pro under each scorer (exact, SIMD, SIMD plus exact rerank), OPQ, RaBitQ, FAISS-PQ, ScaNN (new to the harness).</w:t>
+      </w:r>
+    </w:p>
+    <w:p>
+      <w:pPr>
+        <w:pStyle w:val="ListParagraph"/>
+      </w:pPr>
+      <w:r>
+        <w:t xml:space="preserve">• </w:t>
+      </w:r>
+      <w:r>
+        <w:rPr>
+          <w:b/>
+        </w:rPr>
+        <w:t>Per system and scorer:</w:t>
+      </w:r>
+      <w:r>
+        <w:t xml:space="preserve"> recall@10 per stage (routing against compressed scan; scoring against exact ADC; representation and rerank against fp32 L1), per OVB difficulty stratum; QPS at fixed threads; per-query latency p50, p95 and p99; rerank width and its cost; total bytes per row including the auxiliary terms (m_n, norms) and the rerank tier; scorer provenance on every record.</w:t>
+      </w:r>
+    </w:p>
+    <w:p>
+      <w:pPr>
+        <w:pStyle w:val="ListParagraph"/>
+      </w:pPr>
+      <w:r>
+        <w:t xml:space="preserve">• </w:t>
+      </w:r>
+      <w:r>
+        <w:rPr>
+          <w:b/>
+        </w:rPr>
+        <w:t>Plus:</w:t>
+      </w:r>
+      <w:r>
+        <w:t xml:space="preserve"> the cell-rank prediction of probe depth, registered against OVB's real tiers (section 3).</w:t>
+      </w:r>
+    </w:p>
+    <w:p>
+      <w:pPr>
+        <w:pStyle w:val="ListParagraph"/>
+      </w:pPr>
+      <w:r>
+        <w:t xml:space="preserve">• </w:t>
+      </w:r>
+      <w:r>
+        <w:rPr>
+          <w:b/>
+        </w:rPr>
+        <w:t>Reuse:</w:t>
+      </w:r>
+      <w:r>
+        <w:t xml:space="preserve"> its timing table is #181's hardware cost table; its bytes-read columns are #175 phase 2's baseline; the same harness later runs #174 phase 3 and #176 phase 3.</w:t>
+      </w:r>
+    </w:p>
+    <w:p>
+      <w:r>
+        <w:t>Ordering: after #172 step 3 is scored. The campaign results stay sealed until the planner exit test's plan records are committed, and this run must not open them early.</w:t>
+      </w:r>
+    </w:p>
+    <w:p>
+      <w:pPr>
+        <w:pStyle w:val="Heading2"/>
+      </w:pPr>
+      <w:r>
+        <w:t>5. Decisions for the owner</w:t>
+      </w:r>
+    </w:p>
+    <w:p>
+      <w:pPr>
+        <w:pStyle w:val="ListParagraph"/>
+      </w:pPr>
+      <w:r>
+        <w:t xml:space="preserve">• </w:t>
+      </w:r>
+      <w:r>
+        <w:rPr>
+          <w:b/>
+        </w:rPr>
+        <w:t>Hardware for the timings.</w:t>
+      </w:r>
+      <w:r>
+        <w:t xml:space="preserve"> Timings are comparable only on one machine type. NRP nodes vary, and a 1M x 1536 rerank tier (about 6 GB of fp32 originals) does not fit NRP's exempt class (1 CPU, 2 GiB). Options: Atlas (fixed hardware, AVX2, costs electricity), or NRP with a pinned node type and a request sized to meet the utilization rules.</w:t>
+      </w:r>
+    </w:p>
+    <w:p>
+      <w:pPr>
+        <w:pStyle w:val="ListParagraph"/>
+      </w:pPr>
+      <w:r>
+        <w:t xml:space="preserve">• </w:t>
+      </w:r>
+      <w:r>
+        <w:rPr>
+          <w:b/>
+        </w:rPr>
+        <w:t>Whether ScaNN joins.</w:t>
+      </w:r>
+      <w:r>
+        <w:t xml:space="preserve"> A new dependency and build time for the harness.</w:t>
+      </w:r>
+    </w:p>
+    <w:p>
+      <w:pPr>
+        <w:pStyle w:val="ListParagraph"/>
+      </w:pPr>
+      <w:r>
+        <w:t xml:space="preserve">• </w:t>
+      </w:r>
+      <w:r>
+        <w:rPr>
+          <w:b/>
+        </w:rPr>
+        <w:t>OVB tiers.</w:t>
+      </w:r>
+      <w:r>
+        <w:t xml:space="preserve"> Which OVB real tiers are usable below the seam today, and whether their difficulty strata are published for the query sets we would use.</w:t>
+      </w:r>
+    </w:p>
+    <w:p>
+      <w:pPr>
+        <w:pStyle w:val="Heading2"/>
+      </w:pPr>
+      <w:r>
+        <w:t>6. The revised order</w:t>
+      </w:r>
+    </w:p>
+    <w:p>
+      <w:pPr>
+        <w:pStyle w:val="ListParagraph"/>
+      </w:pPr>
+      <w:r>
+        <w:t xml:space="preserve">1. </w:t>
+      </w:r>
+      <w:r>
+        <w:rPr>
+          <w:b/>
+        </w:rPr>
+        <w:t>Now.</w:t>
+      </w:r>
+      <w:r>
+        <w:t xml:space="preserve"> Merge #274 (one contract; search-side scorer identity).</w:t>
+      </w:r>
+    </w:p>
+    <w:p>
+      <w:pPr>
+        <w:pStyle w:val="ListParagraph"/>
+      </w:pPr>
+      <w:r>
+        <w:t xml:space="preserve">2. </w:t>
+      </w:r>
+      <w:r>
+        <w:rPr>
+          <w:b/>
+        </w:rPr>
+        <w:t>Next.</w:t>
+      </w:r>
+      <w:r>
+        <w:t xml:space="preserve"> #175: bind the adaptive policy to its scorer. #177: add the scorer-change check. Code only, small.</w:t>
+      </w:r>
+    </w:p>
+    <w:p>
+      <w:pPr>
+        <w:pStyle w:val="ListParagraph"/>
+      </w:pPr>
+      <w:r>
+        <w:t xml:space="preserve">3. </w:t>
+      </w:r>
+      <w:r>
+        <w:t xml:space="preserve"> Scorer provenance in the benchmark artifacts (bench_adc_kernel_v2, bench_ivf, bench_ivf_sharded, bench_pruned_scan).</w:t>
+      </w:r>
+    </w:p>
+    <w:p>
+      <w:pPr>
+        <w:pStyle w:val="ListParagraph"/>
+      </w:pPr>
+      <w:r>
+        <w:t xml:space="preserve">4. </w:t>
+      </w:r>
+      <w:r>
+        <w:t xml:space="preserve"> #173: scorer in contract consumer entries; #178 and #182 read it.</w:t>
+      </w:r>
+    </w:p>
+    <w:p>
+      <w:pPr>
+        <w:pStyle w:val="ListParagraph"/>
+      </w:pPr>
+      <w:r>
+        <w:t xml:space="preserve">5. </w:t>
+      </w:r>
+      <w:r>
+        <w:t xml:space="preserve"> OVB README: record the 10^12 result as systems evidence under 'Distribution at scale', keep 'Why the 10^11 recall numbers aren't a tier' (now 10^11 and 10^12), and add the stage table from section 3.</w:t>
+      </w:r>
+    </w:p>
+    <w:p>
+      <w:pPr>
+        <w:pStyle w:val="ListParagraph"/>
+      </w:pPr>
+      <w:r>
+        <w:t xml:space="preserve">6. </w:t>
+      </w:r>
+      <w:r>
+        <w:t xml:space="preserve"> Finish and score #172 step 3 (launched 2026-09-24; its current state is to be confirmed before step 7).</w:t>
+      </w:r>
+    </w:p>
+    <w:p>
+      <w:pPr>
+        <w:pStyle w:val="ListParagraph"/>
+      </w:pPr>
+      <w:r>
+        <w:t xml:space="preserve">7. </w:t>
+      </w:r>
+      <w:r>
+        <w:t xml:space="preserve"> Write the preregistration for section 4, including the cell-rank prediction on OVB's real tiers. Commit it before any run.</w:t>
+      </w:r>
+    </w:p>
+    <w:p>
+      <w:pPr>
+        <w:pStyle w:val="ListParagraph"/>
+      </w:pPr>
+      <w:r>
+        <w:t xml:space="preserve">8. </w:t>
+      </w:r>
+      <w:r>
+        <w:t xml:space="preserve"> Run it. From its data: #175 phase 2, #176 phase 3, #181's cost table. Then #174 phase 2 (the layered container) and its phase 3 on the same harness.</w:t>
+      </w:r>
+    </w:p>
+    <w:p>
+      <w:r>
+        <w:t>The front three of the original plan (Observer Contracts, progressive codes, adaptive certified refinement) keep their priority as features. The reviews add the layer under them: every result names the reader that made it and the reference it was measured against.</w:t>
+      </w:r>
+    </w:p>
     <w:sectPr>
       <w:pgSz w:w="12240" w:h="15840"/>
       <w:pgMar w:top="1440" w:right="1440" w:bottom="1440" w:left="1440" w:header="720" w:footer="720" w:gutter="0"/>

</xml_diff>

<commit_message>
Plan: merge the fast-ADC review and the OpenVector Bench review into the feature plan (#275)
Adds a dated addendum to docs/notes/turboquant-pro_feature-requests.docx; the
original text is unchanged. The scorer becomes part of every feature that names
a reader (#173, #175, #177, #178, #182, #174), the review's 1M experiment and
the OVB stage decomposition become one preregistered measurement that also
feeds #175 phase 2, #176 phase 3 and #181, and the 10^12 result is placed in
OVB as systems evidence with its realism caveat kept.

Co-authored-by: Claude Opus 5.5 (1M context) <noreply@anthropic.com>
</commit_message>
<xml_diff>
--- a/docs/notes/turboquant-pro_feature-requests.docx
+++ b/docs/notes/turboquant-pro_feature-requests.docx
@@ -2217,6 +2217,966 @@
       </w:r>
     </w:p>
     <w:p/>
+    <w:p>
+      <w:r>
+        <w:br w:type="page"/>
+      </w:r>
+    </w:p>
+    <w:p>
+      <w:pPr>
+        <w:pStyle w:val="Heading1"/>
+      </w:pPr>
+      <w:r>
+        <w:t>Addendum, 2026-09-29: two reviews merged into this plan</w:t>
+      </w:r>
+    </w:p>
+    <w:p>
+      <w:r>
+        <w:t>Two reviews arrived on 2026-09-29. The first is about the fast ADC kernel and asks for three things: one contract in the docs, scorer identity in the API, and a 1M systems experiment. The second places the 10^12 recall result inside OpenVector Bench (OVB). This addendum folds both into the plan above (issues #173 to #182, umbrella #183) instead of running them as separate tracks, because each one touches features that are already here. The text above this page is unchanged.</w:t>
+      </w:r>
+    </w:p>
+    <w:p>
+      <w:pPr>
+        <w:pStyle w:val="Heading2"/>
+      </w:pPr>
+      <w:r>
+        <w:t>1. What the reviews asked, and where each item stands</w:t>
+      </w:r>
+    </w:p>
+    <w:tbl>
+      <w:tblPr>
+        <w:tblW w:type="auto" w:w="0"/>
+        <w:tblLook w:firstColumn="1" w:firstRow="1" w:lastColumn="0" w:lastRow="0" w:noHBand="0" w:noVBand="1" w:val="04A0"/>
+        <w:tblBorders>
+          <w:top w:val="single" w:sz="4" w:color="999999"/>
+          <w:left w:val="single" w:sz="4" w:color="999999"/>
+          <w:bottom w:val="single" w:sz="4" w:color="999999"/>
+          <w:right w:val="single" w:sz="4" w:color="999999"/>
+          <w:insideH w:val="single" w:sz="4" w:color="999999"/>
+          <w:insideV w:val="single" w:sz="4" w:color="999999"/>
+        </w:tblBorders>
+      </w:tblPr>
+      <w:tblGrid>
+        <w:gridCol w:w="3120"/>
+        <w:gridCol w:w="3120"/>
+        <w:gridCol w:w="3120"/>
+      </w:tblGrid>
+      <w:tr>
+        <w:trPr>
+          <w:tblHeader w:val="true"/>
+          <w:cantSplit w:val="true"/>
+        </w:trPr>
+        <w:tc>
+          <w:tcPr>
+            <w:tcW w:type="dxa" w:w="3120"/>
+          </w:tcPr>
+          <w:p>
+            <w:r/>
+            <w:r>
+              <w:rPr>
+                <w:b/>
+              </w:rPr>
+              <w:t>Item</w:t>
+            </w:r>
+          </w:p>
+        </w:tc>
+        <w:tc>
+          <w:tcPr>
+            <w:tcW w:type="dxa" w:w="3120"/>
+          </w:tcPr>
+          <w:p>
+            <w:r/>
+            <w:r>
+              <w:rPr>
+                <w:b/>
+              </w:rPr>
+              <w:t>Status on 2026-09-29</w:t>
+            </w:r>
+          </w:p>
+        </w:tc>
+        <w:tc>
+          <w:tcPr>
+            <w:tcW w:type="dxa" w:w="3120"/>
+          </w:tcPr>
+          <w:p>
+            <w:r/>
+            <w:r>
+              <w:rPr>
+                <w:b/>
+              </w:rPr>
+              <w:t>Lands in</w:t>
+            </w:r>
+          </w:p>
+        </w:tc>
+      </w:tr>
+      <w:tr>
+        <w:tc>
+          <w:tcPr>
+            <w:tcW w:type="dxa" w:w="3120"/>
+          </w:tcPr>
+          <w:p>
+            <w:r>
+              <w:t>One contract across the docs: exact ADC, SIMD ADC, SIMD plus exact rerank</w:t>
+            </w:r>
+          </w:p>
+        </w:tc>
+        <w:tc>
+          <w:tcPr>
+            <w:tcW w:type="dxa" w:w="3120"/>
+          </w:tcPr>
+          <w:p>
+            <w:r>
+              <w:t>Done in PR #274 (CI green, not merged)</w:t>
+            </w:r>
+          </w:p>
+        </w:tc>
+        <w:tc>
+          <w:tcPr>
+            <w:tcW w:type="dxa" w:w="3120"/>
+          </w:tcPr>
+          <w:p>
+            <w:r>
+              <w:t>DESIGN_fast_adc.md, 'The contract, in one place'</w:t>
+            </w:r>
+          </w:p>
+        </w:tc>
+      </w:tr>
+      <w:tr>
+        <w:tc>
+          <w:tcPr>
+            <w:tcW w:type="dxa" w:w="3120"/>
+          </w:tcPr>
+          <w:p>
+            <w:r>
+              <w:t>State the 100k result as an operating point, not 'the trilemma is broken'</w:t>
+            </w:r>
+          </w:p>
+        </w:tc>
+        <w:tc>
+          <w:tcPr>
+            <w:tcW w:type="dxa" w:w="3120"/>
+          </w:tcPr>
+          <w:p>
+            <w:r>
+              <w:t>Done in PR #274</w:t>
+            </w:r>
+          </w:p>
+        </w:tc>
+        <w:tc>
+          <w:tcPr>
+            <w:tcW w:type="dxa" w:w="3120"/>
+          </w:tcPr>
+          <w:p>
+            <w:r>
+              <w:t>DESIGN_fast_adc.md M3-final, COMPREHENSIVE_ANALYSIS.md</w:t>
+            </w:r>
+          </w:p>
+        </w:tc>
+      </w:tr>
+      <w:tr>
+        <w:tc>
+          <w:tcPr>
+            <w:tcW w:type="dxa" w:w="3120"/>
+          </w:tcPr>
+          <w:p>
+            <w:r>
+              <w:t>Scorer identity first-class: mode='exact'|'fast', provenance on results</w:t>
+            </w:r>
+          </w:p>
+        </w:tc>
+        <w:tc>
+          <w:tcPr>
+            <w:tcW w:type="dxa" w:w="3120"/>
+          </w:tcPr>
+          <w:p>
+            <w:r>
+              <w:t>Search side done in PR #274. Open: bind policies and certificates to the scorer; scorer provenance in benchmark artifacts</w:t>
+            </w:r>
+          </w:p>
+        </w:tc>
+        <w:tc>
+          <w:tcPr>
+            <w:tcW w:type="dxa" w:w="3120"/>
+          </w:tcPr>
+          <w:p>
+            <w:r>
+              <w:t>#175, #177, #173, benchmarks</w:t>
+            </w:r>
+          </w:p>
+        </w:tc>
+      </w:tr>
+      <w:tr>
+        <w:tc>
+          <w:tcPr>
+            <w:tcW w:type="dxa" w:w="3120"/>
+          </w:tcPr>
+          <w:p>
+            <w:r>
+              <w:t>1M kernel experiment: QPS, latency distribution, rerank width and cost, total bytes, five systems on identical hardware</w:t>
+            </w:r>
+          </w:p>
+        </w:tc>
+        <w:tc>
+          <w:tcPr>
+            <w:tcW w:type="dxa" w:w="3120"/>
+          </w:tcPr>
+          <w:p>
+            <w:r>
+              <w:t>Not started. Merged into the stage-decomposed measurement (section 4)</w:t>
+            </w:r>
+          </w:p>
+        </w:tc>
+        <w:tc>
+          <w:tcPr>
+            <w:tcW w:type="dxa" w:w="3120"/>
+          </w:tcPr>
+          <w:p>
+            <w:r>
+              <w:t>#172, #174, #175, #176, #181, OVB</w:t>
+            </w:r>
+          </w:p>
+        </w:tc>
+      </w:tr>
+      <w:tr>
+        <w:tc>
+          <w:tcPr>
+            <w:tcW w:type="dxa" w:w="3120"/>
+          </w:tcPr>
+          <w:p>
+            <w:r>
+              <w:t>Place 10^12 inside OVB; keep the realism caveat; report recall by stage</w:t>
+            </w:r>
+          </w:p>
+        </w:tc>
+        <w:tc>
+          <w:tcPr>
+            <w:tcW w:type="dxa" w:w="3120"/>
+          </w:tcPr>
+          <w:p>
+            <w:r>
+              <w:t>Not started (section 3)</w:t>
+            </w:r>
+          </w:p>
+        </w:tc>
+        <w:tc>
+          <w:tcPr>
+            <w:tcW w:type="dxa" w:w="3120"/>
+          </w:tcPr>
+          <w:p>
+            <w:r>
+              <w:t>OVB README, the measurement in section 4</w:t>
+            </w:r>
+          </w:p>
+        </w:tc>
+      </w:tr>
+    </w:tbl>
+    <w:p/>
+    <w:p>
+      <w:pPr>
+        <w:pStyle w:val="Heading2"/>
+      </w:pPr>
+      <w:r>
+        <w:t>2. The scorer is an observer, so every feature that names a reader names it</w:t>
+      </w:r>
+    </w:p>
+    <w:p>
+      <w:r>
+        <w:t>The first review's layering is the same shape as this plan. The exact scorer is the reference semantics. The SIMD scorer is a bounded-resolution approximation. The rerank reconciles the boundary region. A certificate is anchored to named semantics. In this plan: a contract names the reader, a certificate states when it is valid, and adaptive refinement spends observation only where the margin is not decisive. The SIMD kernel is itself a reader of the codes, with a stated resolution (255 levels of one query-global scale; every score within 5% of the top-k spread, tested). So each feature that names a reader must also name the scorer.</w:t>
+      </w:r>
+    </w:p>
+    <w:p>
+      <w:pPr>
+        <w:pStyle w:val="ListParagraph"/>
+      </w:pPr>
+      <w:r>
+        <w:t xml:space="preserve">• </w:t>
+      </w:r>
+      <w:r>
+        <w:rPr>
+          <w:b/>
+        </w:rPr>
+        <w:t>#173 Observer Contracts.</w:t>
+      </w:r>
+      <w:r>
+        <w:t xml:space="preserve"> A consumer entry may declare scorer: exact | fast. Claim replay and certificate anchors require exact. The default stays fast.</w:t>
+      </w:r>
+    </w:p>
+    <w:p>
+      <w:pPr>
+        <w:pStyle w:val="ListParagraph"/>
+      </w:pPr>
+      <w:r>
+        <w:t xml:space="preserve">• </w:t>
+      </w:r>
+      <w:r>
+        <w:rPr>
+          <w:b/>
+        </w:rPr>
+        <w:t>#175 Adaptive refinement.</w:t>
+      </w:r>
+      <w:r>
+        <w:t xml:space="preserve"> Finding: the policy fingerprint drops the index's kernel flag, so a band calibrated on SIMD scores is accepted on an install that scans with the exact scorer, and the reverse. The conformal guarantee is calibrated on one scorer's score distribution and does not transfer. Fix: bind the policy to the first-stage scorer (name, kernel version, table) and refuse a mismatch with the reason. Small; first in the queue. The phase-3 middle stage (base plus layer) is another scorer and gets its own name.</w:t>
+      </w:r>
+    </w:p>
+    <w:p>
+      <w:pPr>
+        <w:pStyle w:val="ListParagraph"/>
+      </w:pPr>
+      <w:r>
+        <w:t xml:space="preserve">• </w:t>
+      </w:r>
+      <w:r>
+        <w:rPr>
+          <w:b/>
+        </w:rPr>
+        <w:t>#177 Certificates expire.</w:t>
+      </w:r>
+      <w:r>
+        <w:t xml:space="preserve"> A change of first-stage scorer (fast to exact, a kernel version, the table's levels) is a change of observer. Add it as a validity check: STALE, reason 'first-stage scorer changed', action RECERTIFY.</w:t>
+      </w:r>
+    </w:p>
+    <w:p>
+      <w:pPr>
+        <w:pStyle w:val="ListParagraph"/>
+      </w:pPr>
+      <w:r>
+        <w:t xml:space="preserve">• </w:t>
+      </w:r>
+      <w:r>
+        <w:rPr>
+          <w:b/>
+        </w:rPr>
+        <w:t>#178 Capability discovery.</w:t>
+      </w:r>
+      <w:r>
+        <w:t xml:space="preserve"> Each certified capability states the scorer it holds under, for example 'cosine top-10 retrieval, SIMD plus exact rerank'.</w:t>
+      </w:r>
+    </w:p>
+    <w:p>
+      <w:pPr>
+        <w:pStyle w:val="ListParagraph"/>
+      </w:pPr>
+      <w:r>
+        <w:t xml:space="preserve">• </w:t>
+      </w:r>
+      <w:r>
+        <w:rPr>
+          <w:b/>
+        </w:rPr>
+        <w:t>#182 Pipeline composition.</w:t>
+      </w:r>
+      <w:r>
+        <w:t xml:space="preserve"> The SIMD scan and the rerank are two stages of the chain. The kernel's tested resolution bound is that stage's distortion term.</w:t>
+      </w:r>
+    </w:p>
+    <w:p>
+      <w:pPr>
+        <w:pStyle w:val="ListParagraph"/>
+      </w:pPr>
+      <w:r>
+        <w:t xml:space="preserve">• </w:t>
+      </w:r>
+      <w:r>
+        <w:rPr>
+          <w:b/>
+        </w:rPr>
+        <w:t>#174 Progressive codes.</w:t>
+      </w:r>
+      <w:r>
+        <w:t xml:space="preserve"> The layered reader is 'bit-exact with a flat index at the same total widths' only under one scorer. The phase-2 test states which.</w:t>
+      </w:r>
+    </w:p>
+    <w:p>
+      <w:pPr>
+        <w:pStyle w:val="Heading2"/>
+      </w:pPr>
+      <w:r>
+        <w:t>3. OpenVector Bench: recall is a composition of stages</w:t>
+      </w:r>
+    </w:p>
+    <w:p>
+      <w:r>
+        <w:t>OVB separates three truth layers (L1 geometric, L2 structural, L3 human) and nests its tiers so that only N changes between them. The TurboQuant Pro measurements already factor the L1 side into stages, each against a named reference:</w:t>
+      </w:r>
+    </w:p>
+    <w:tbl>
+      <w:tblPr>
+        <w:tblW w:type="auto" w:w="0"/>
+        <w:tblLook w:firstColumn="1" w:firstRow="1" w:lastColumn="0" w:lastRow="0" w:noHBand="0" w:noVBand="1" w:val="04A0"/>
+        <w:tblBorders>
+          <w:top w:val="single" w:sz="4" w:color="999999"/>
+          <w:left w:val="single" w:sz="4" w:color="999999"/>
+          <w:bottom w:val="single" w:sz="4" w:color="999999"/>
+          <w:right w:val="single" w:sz="4" w:color="999999"/>
+          <w:insideH w:val="single" w:sz="4" w:color="999999"/>
+          <w:insideV w:val="single" w:sz="4" w:color="999999"/>
+        </w:tblBorders>
+      </w:tblPr>
+      <w:tblGrid>
+        <w:gridCol w:w="2340"/>
+        <w:gridCol w:w="2340"/>
+        <w:gridCol w:w="2340"/>
+        <w:gridCol w:w="2340"/>
+      </w:tblGrid>
+      <w:tr>
+        <w:trPr>
+          <w:tblHeader w:val="true"/>
+          <w:cantSplit w:val="true"/>
+        </w:trPr>
+        <w:tc>
+          <w:tcPr>
+            <w:tcW w:type="dxa" w:w="2340"/>
+          </w:tcPr>
+          <w:p>
+            <w:r/>
+            <w:r>
+              <w:rPr>
+                <w:b/>
+              </w:rPr>
+              <w:t>Stage</w:t>
+            </w:r>
+          </w:p>
+        </w:tc>
+        <w:tc>
+          <w:tcPr>
+            <w:tcW w:type="dxa" w:w="2340"/>
+          </w:tcPr>
+          <w:p>
+            <w:r/>
+            <w:r>
+              <w:rPr>
+                <w:b/>
+              </w:rPr>
+              <w:t>Measured against</w:t>
+            </w:r>
+          </w:p>
+        </w:tc>
+        <w:tc>
+          <w:tcPr>
+            <w:tcW w:type="dxa" w:w="2340"/>
+          </w:tcPr>
+          <w:p>
+            <w:r/>
+            <w:r>
+              <w:rPr>
+                <w:b/>
+              </w:rPr>
+              <w:t>What we have</w:t>
+            </w:r>
+          </w:p>
+        </w:tc>
+        <w:tc>
+          <w:tcPr>
+            <w:tcW w:type="dxa" w:w="2340"/>
+          </w:tcPr>
+          <w:p>
+            <w:r/>
+            <w:r>
+              <w:rPr>
+                <w:b/>
+              </w:rPr>
+              <w:t>Where</w:t>
+            </w:r>
+          </w:p>
+        </w:tc>
+      </w:tr>
+      <w:tr>
+        <w:tc>
+          <w:tcPr>
+            <w:tcW w:type="dxa" w:w="2340"/>
+          </w:tcPr>
+          <w:p>
+            <w:r>
+              <w:t>Routing (IVF)</w:t>
+            </w:r>
+          </w:p>
+        </w:tc>
+        <w:tc>
+          <w:tcPr>
+            <w:tcW w:type="dxa" w:w="2340"/>
+          </w:tcPr>
+          <w:p>
+            <w:r>
+              <w:t>the compressed exact scan</w:t>
+            </w:r>
+          </w:p>
+        </w:tc>
+        <w:tc>
+          <w:tcPr>
+            <w:tcW w:type="dxa" w:w="2340"/>
+          </w:tcPr>
+          <w:p>
+            <w:r>
+              <w:t>flat from 20M to 10^12 rows: 0.989 at nprobe 32, 0.999 at nprobe 128; the probe sweep 16/64/256 (0.952/0.997/1.000) equals the cell-rank prediction</w:t>
+            </w:r>
+          </w:p>
+        </w:tc>
+        <w:tc>
+          <w:tcPr>
+            <w:tcW w:type="dxa" w:w="2340"/>
+          </w:tcPr>
+          <w:p>
+            <w:r>
+              <w:t>1T_RECALL_RESULT_2026-09-27.md</w:t>
+            </w:r>
+          </w:p>
+        </w:tc>
+      </w:tr>
+      <w:tr>
+        <w:tc>
+          <w:tcPr>
+            <w:tcW w:type="dxa" w:w="2340"/>
+          </w:tcPr>
+          <w:p>
+            <w:r>
+              <w:t>Scoring (SIMD against exact ADC)</w:t>
+            </w:r>
+          </w:p>
+        </w:tc>
+        <w:tc>
+          <w:tcPr>
+            <w:tcW w:type="dxa" w:w="2340"/>
+          </w:tcPr>
+          <w:p>
+            <w:r>
+              <w:t>the exact ADC</w:t>
+            </w:r>
+          </w:p>
+        </w:tc>
+        <w:tc>
+          <w:tcPr>
+            <w:tcW w:type="dxa" w:w="2340"/>
+          </w:tcPr>
+          <w:p>
+            <w:r>
+              <w:t>top-10 agreement 0.9775 at 100k LaBSE; within 5% of the top-k spread in tests</w:t>
+            </w:r>
+          </w:p>
+        </w:tc>
+        <w:tc>
+          <w:tcPr>
+            <w:tcW w:type="dxa" w:w="2340"/>
+          </w:tcPr>
+          <w:p>
+            <w:r>
+              <w:t>DESIGN_fast_adc.md section 3b</w:t>
+            </w:r>
+          </w:p>
+        </w:tc>
+      </w:tr>
+      <w:tr>
+        <w:tc>
+          <w:tcPr>
+            <w:tcW w:type="dxa" w:w="2340"/>
+          </w:tcPr>
+          <w:p>
+            <w:r>
+              <w:t>Representation (codes against fp32)</w:t>
+            </w:r>
+          </w:p>
+        </w:tc>
+        <w:tc>
+          <w:tcPr>
+            <w:tcW w:type="dxa" w:w="2340"/>
+          </w:tcPr>
+          <w:p>
+            <w:r>
+              <w:t>fp32 exact k-NN (OVB L1)</w:t>
+            </w:r>
+          </w:p>
+        </w:tc>
+        <w:tc>
+          <w:tcPr>
+            <w:tcW w:type="dxa" w:w="2340"/>
+          </w:tcPr>
+          <w:p>
+            <w:r>
+              <w:t>0.592 at 10^9 before rerank, against 0.999 for the index's own ranking</w:t>
+            </w:r>
+          </w:p>
+        </w:tc>
+        <w:tc>
+          <w:tcPr>
+            <w:tcW w:type="dxa" w:w="2340"/>
+          </w:tcPr>
+          <w:p>
+            <w:r>
+              <w:t>OVB README, 'Why'</w:t>
+            </w:r>
+          </w:p>
+        </w:tc>
+      </w:tr>
+      <w:tr>
+        <w:tc>
+          <w:tcPr>
+            <w:tcW w:type="dxa" w:w="2340"/>
+          </w:tcPr>
+          <w:p>
+            <w:r>
+              <w:t>Rerank</w:t>
+            </w:r>
+          </w:p>
+        </w:tc>
+        <w:tc>
+          <w:tcPr>
+            <w:tcW w:type="dxa" w:w="2340"/>
+          </w:tcPr>
+          <w:p>
+            <w:r>
+              <w:t>fp32 exact k-NN</w:t>
+            </w:r>
+          </w:p>
+        </w:tc>
+        <w:tc>
+          <w:tcPr>
+            <w:tcW w:type="dxa" w:w="2340"/>
+          </w:tcPr>
+          <w:p>
+            <w:r>
+              <w:t>0.9995 at 100k LaBSE (the two-stage path)</w:t>
+            </w:r>
+          </w:p>
+        </w:tc>
+        <w:tc>
+          <w:tcPr>
+            <w:tcW w:type="dxa" w:w="2340"/>
+          </w:tcPr>
+          <w:p>
+            <w:r>
+              <w:t>DESIGN_fast_adc.md M3-final</w:t>
+            </w:r>
+          </w:p>
+        </w:tc>
+      </w:tr>
+      <w:tr>
+        <w:tc>
+          <w:tcPr>
+            <w:tcW w:type="dxa" w:w="2340"/>
+          </w:tcPr>
+          <w:p>
+            <w:r>
+              <w:t>Relevance</w:t>
+            </w:r>
+          </w:p>
+        </w:tc>
+        <w:tc>
+          <w:tcPr>
+            <w:tcW w:type="dxa" w:w="2340"/>
+          </w:tcPr>
+          <w:p>
+            <w:r>
+              <w:t>OVB L2 and L3</w:t>
+            </w:r>
+          </w:p>
+        </w:tc>
+        <w:tc>
+          <w:tcPr>
+            <w:tcW w:type="dxa" w:w="2340"/>
+          </w:tcPr>
+          <w:p>
+            <w:r>
+              <w:t>not measured</w:t>
+            </w:r>
+          </w:p>
+        </w:tc>
+        <w:tc>
+          <w:tcPr>
+            <w:tcW w:type="dxa" w:w="2340"/>
+          </w:tcPr>
+          <w:p>
+            <w:r>
+              <w:t>OVB truth layers</w:t>
+            </w:r>
+          </w:p>
+        </w:tc>
+      </w:tr>
+    </w:tbl>
+    <w:p/>
+    <w:p>
+      <w:r>
+        <w:t>What this separates, and what it does not. The distribution machinery works to 10^12. Routing fidelity against the compressed scan is flat in N on this corpus family. Representation fidelity is measurably imperfect. Synthetic-to-real transfer of ANN difficulty is not established: OVB's open IVF study found real data needs nprobe 47 to 50 for 95% recall where the generator needs 2 (R80_ANN), and RC-1 rejects the low-rank class the fleet corpus belongs to. So the 10^12 result is systems evidence and an instrument calibration at extreme scale. It is not an OVB tier, and its caveat stays. 'Scale does not collapse routing' holds for this controlled family only.</w:t>
+      </w:r>
+    </w:p>
+    <w:p>
+      <w:r>
+        <w:t>The testable link between the two repos. The cell-rank prediction reproduced the 10^12 probe curve exactly, and it needs only the index and the reference neighbours' cell ranks, not a model of the corpus. If it also predicts the real corpus's probe depth on OVB's real tiers below the seam, then the 25x divergence lives in where each query's true neighbours fall among the cells: a query-corpus relationship, which is where OVB's R107 replication located the query-side signal. If it fails there, routing on real data has a component the cell ranks miss. Either outcome is informative, and it can be registered before it is run.</w:t>
+      </w:r>
+    </w:p>
+    <w:p>
+      <w:pPr>
+        <w:pStyle w:val="Heading2"/>
+      </w:pPr>
+      <w:r>
+        <w:t>4. One registered measurement instead of four</w:t>
+      </w:r>
+    </w:p>
+    <w:p>
+      <w:r>
+        <w:t>Several open phases are waiting on measurements on public data: #175 phase 2 (rows and bytes read, mean and p99, against fixed rerank=5), #174 phase 3 (layered reader against flat, measured tax), #176 phase 3 (predicted payload against the planner's choice), and #181, which is blocked until a scan rate and a fetch latency are measured on named hardware. The first review's 1M experiment asks for that kind of run. The second review asks that recall be reported by stage and truth layer. One preregistered measurement serves all of them:</w:t>
+      </w:r>
+    </w:p>
+    <w:p>
+      <w:pPr>
+        <w:pStyle w:val="ListParagraph"/>
+      </w:pPr>
+      <w:r>
+        <w:t xml:space="preserve">• </w:t>
+      </w:r>
+      <w:r>
+        <w:rPr>
+          <w:b/>
+        </w:rPr>
+        <w:t>Corpora:</w:t>
+      </w:r>
+      <w:r>
+        <w:t xml:space="preserve"> OVB's real tiers below the seam, where L1 ground truth and per-query difficulty strata are published, plus the existing campaign arms (benchmarks/rabitq_public: DBpedia ada-002 1M, DBpedia text-embedding-3-large 1M, Wikipedia-1024 10M).</w:t>
+      </w:r>
+    </w:p>
+    <w:p>
+      <w:pPr>
+        <w:pStyle w:val="ListParagraph"/>
+      </w:pPr>
+      <w:r>
+        <w:t xml:space="preserve">• </w:t>
+      </w:r>
+      <w:r>
+        <w:rPr>
+          <w:b/>
+        </w:rPr>
+        <w:t>Systems:</w:t>
+      </w:r>
+      <w:r>
+        <w:t xml:space="preserve"> TurboQuant Pro under each scorer (exact, SIMD, SIMD plus exact rerank), OPQ, RaBitQ, FAISS-PQ, ScaNN (new to the harness).</w:t>
+      </w:r>
+    </w:p>
+    <w:p>
+      <w:pPr>
+        <w:pStyle w:val="ListParagraph"/>
+      </w:pPr>
+      <w:r>
+        <w:t xml:space="preserve">• </w:t>
+      </w:r>
+      <w:r>
+        <w:rPr>
+          <w:b/>
+        </w:rPr>
+        <w:t>Per system and scorer:</w:t>
+      </w:r>
+      <w:r>
+        <w:t xml:space="preserve"> recall@10 per stage (routing against compressed scan; scoring against exact ADC; representation and rerank against fp32 L1), per OVB difficulty stratum; QPS at fixed threads; per-query latency p50, p95 and p99; rerank width and its cost; total bytes per row including the auxiliary terms (m_n, norms) and the rerank tier; scorer provenance on every record.</w:t>
+      </w:r>
+    </w:p>
+    <w:p>
+      <w:pPr>
+        <w:pStyle w:val="ListParagraph"/>
+      </w:pPr>
+      <w:r>
+        <w:t xml:space="preserve">• </w:t>
+      </w:r>
+      <w:r>
+        <w:rPr>
+          <w:b/>
+        </w:rPr>
+        <w:t>Plus:</w:t>
+      </w:r>
+      <w:r>
+        <w:t xml:space="preserve"> the cell-rank prediction of probe depth, registered against OVB's real tiers (section 3).</w:t>
+      </w:r>
+    </w:p>
+    <w:p>
+      <w:pPr>
+        <w:pStyle w:val="ListParagraph"/>
+      </w:pPr>
+      <w:r>
+        <w:t xml:space="preserve">• </w:t>
+      </w:r>
+      <w:r>
+        <w:rPr>
+          <w:b/>
+        </w:rPr>
+        <w:t>Reuse:</w:t>
+      </w:r>
+      <w:r>
+        <w:t xml:space="preserve"> its timing table is #181's hardware cost table; its bytes-read columns are #175 phase 2's baseline; the same harness later runs #174 phase 3 and #176 phase 3.</w:t>
+      </w:r>
+    </w:p>
+    <w:p>
+      <w:r>
+        <w:t>Ordering: after #172 step 3 is scored. The campaign results stay sealed until the planner exit test's plan records are committed, and this run must not open them early.</w:t>
+      </w:r>
+    </w:p>
+    <w:p>
+      <w:pPr>
+        <w:pStyle w:val="Heading2"/>
+      </w:pPr>
+      <w:r>
+        <w:t>5. Decisions for the owner</w:t>
+      </w:r>
+    </w:p>
+    <w:p>
+      <w:pPr>
+        <w:pStyle w:val="ListParagraph"/>
+      </w:pPr>
+      <w:r>
+        <w:t xml:space="preserve">• </w:t>
+      </w:r>
+      <w:r>
+        <w:rPr>
+          <w:b/>
+        </w:rPr>
+        <w:t>Hardware for the timings.</w:t>
+      </w:r>
+      <w:r>
+        <w:t xml:space="preserve"> Timings are comparable only on one machine type. NRP nodes vary, and a 1M x 1536 rerank tier (about 6 GB of fp32 originals) does not fit NRP's exempt class (1 CPU, 2 GiB). Options: Atlas (fixed hardware, AVX2, costs electricity), or NRP with a pinned node type and a request sized to meet the utilization rules.</w:t>
+      </w:r>
+    </w:p>
+    <w:p>
+      <w:pPr>
+        <w:pStyle w:val="ListParagraph"/>
+      </w:pPr>
+      <w:r>
+        <w:t xml:space="preserve">• </w:t>
+      </w:r>
+      <w:r>
+        <w:rPr>
+          <w:b/>
+        </w:rPr>
+        <w:t>Whether ScaNN joins.</w:t>
+      </w:r>
+      <w:r>
+        <w:t xml:space="preserve"> A new dependency and build time for the harness.</w:t>
+      </w:r>
+    </w:p>
+    <w:p>
+      <w:pPr>
+        <w:pStyle w:val="ListParagraph"/>
+      </w:pPr>
+      <w:r>
+        <w:t xml:space="preserve">• </w:t>
+      </w:r>
+      <w:r>
+        <w:rPr>
+          <w:b/>
+        </w:rPr>
+        <w:t>OVB tiers.</w:t>
+      </w:r>
+      <w:r>
+        <w:t xml:space="preserve"> Which OVB real tiers are usable below the seam today, and whether their difficulty strata are published for the query sets we would use.</w:t>
+      </w:r>
+    </w:p>
+    <w:p>
+      <w:pPr>
+        <w:pStyle w:val="Heading2"/>
+      </w:pPr>
+      <w:r>
+        <w:t>6. The revised order</w:t>
+      </w:r>
+    </w:p>
+    <w:p>
+      <w:pPr>
+        <w:pStyle w:val="ListParagraph"/>
+      </w:pPr>
+      <w:r>
+        <w:t xml:space="preserve">1. </w:t>
+      </w:r>
+      <w:r>
+        <w:rPr>
+          <w:b/>
+        </w:rPr>
+        <w:t>Now.</w:t>
+      </w:r>
+      <w:r>
+        <w:t xml:space="preserve"> Merge #274 (one contract; search-side scorer identity).</w:t>
+      </w:r>
+    </w:p>
+    <w:p>
+      <w:pPr>
+        <w:pStyle w:val="ListParagraph"/>
+      </w:pPr>
+      <w:r>
+        <w:t xml:space="preserve">2. </w:t>
+      </w:r>
+      <w:r>
+        <w:rPr>
+          <w:b/>
+        </w:rPr>
+        <w:t>Next.</w:t>
+      </w:r>
+      <w:r>
+        <w:t xml:space="preserve"> #175: bind the adaptive policy to its scorer. #177: add the scorer-change check. Code only, small.</w:t>
+      </w:r>
+    </w:p>
+    <w:p>
+      <w:pPr>
+        <w:pStyle w:val="ListParagraph"/>
+      </w:pPr>
+      <w:r>
+        <w:t xml:space="preserve">3. </w:t>
+      </w:r>
+      <w:r>
+        <w:t xml:space="preserve"> Scorer provenance in the benchmark artifacts (bench_adc_kernel_v2, bench_ivf, bench_ivf_sharded, bench_pruned_scan).</w:t>
+      </w:r>
+    </w:p>
+    <w:p>
+      <w:pPr>
+        <w:pStyle w:val="ListParagraph"/>
+      </w:pPr>
+      <w:r>
+        <w:t xml:space="preserve">4. </w:t>
+      </w:r>
+      <w:r>
+        <w:t xml:space="preserve"> #173: scorer in contract consumer entries; #178 and #182 read it.</w:t>
+      </w:r>
+    </w:p>
+    <w:p>
+      <w:pPr>
+        <w:pStyle w:val="ListParagraph"/>
+      </w:pPr>
+      <w:r>
+        <w:t xml:space="preserve">5. </w:t>
+      </w:r>
+      <w:r>
+        <w:t xml:space="preserve"> OVB README: record the 10^12 result as systems evidence under 'Distribution at scale', keep 'Why the 10^11 recall numbers aren't a tier' (now 10^11 and 10^12), and add the stage table from section 3.</w:t>
+      </w:r>
+    </w:p>
+    <w:p>
+      <w:pPr>
+        <w:pStyle w:val="ListParagraph"/>
+      </w:pPr>
+      <w:r>
+        <w:t xml:space="preserve">6. </w:t>
+      </w:r>
+      <w:r>
+        <w:t xml:space="preserve"> Finish and score #172 step 3 (launched 2026-09-24; its current state is to be confirmed before step 7).</w:t>
+      </w:r>
+    </w:p>
+    <w:p>
+      <w:pPr>
+        <w:pStyle w:val="ListParagraph"/>
+      </w:pPr>
+      <w:r>
+        <w:t xml:space="preserve">7. </w:t>
+      </w:r>
+      <w:r>
+        <w:t xml:space="preserve"> Write the preregistration for section 4, including the cell-rank prediction on OVB's real tiers. Commit it before any run.</w:t>
+      </w:r>
+    </w:p>
+    <w:p>
+      <w:pPr>
+        <w:pStyle w:val="ListParagraph"/>
+      </w:pPr>
+      <w:r>
+        <w:t xml:space="preserve">8. </w:t>
+      </w:r>
+      <w:r>
+        <w:t xml:space="preserve"> Run it. From its data: #175 phase 2, #176 phase 3, #181's cost table. Then #174 phase 2 (the layered container) and its phase 3 on the same harness.</w:t>
+      </w:r>
+    </w:p>
+    <w:p>
+      <w:r>
+        <w:t>The front three of the original plan (Observer Contracts, progressive codes, adaptive certified refinement) keep their priority as features. The reviews add the layer under them: every result names the reader that made it and the reference it was measured against.</w:t>
+      </w:r>
+    </w:p>
     <w:sectPr>
       <w:pgSz w:w="12240" w:h="15840"/>
       <w:pgMar w:top="1440" w:right="1440" w:bottom="1440" w:left="1440" w:header="720" w:footer="720" w:gutter="0"/>

</xml_diff>

<commit_message>
Plan: correct the cell-rank 'testable link'; it holds by construction
Against the same index's full scan, recall at width p equals the share of
reference neighbours with cell rank below p on any corpus, so the exact match
at 10^12 is bookkeeping, not a property of the data. Replaced by the two
registrable questions about the distribution of cell ranks (depth vs N on
nested real tiers; which stratum predicts depth, directions stated first).

Co-Authored-By: Claude Opus 5.5 (1M context) <noreply@anthropic.com>
</commit_message>
<xml_diff>
--- a/docs/notes/turboquant-pro_feature-requests.docx
+++ b/docs/notes/turboquant-pro_feature-requests.docx
@@ -2899,7 +2899,7 @@
     </w:p>
     <w:p>
       <w:r>
-        <w:t>The testable link between the two repos. The cell-rank prediction reproduced the 10^12 probe curve exactly, and it needs only the index and the reference neighbours' cell ranks, not a model of the corpus. If it also predicts the real corpus's probe depth on OVB's real tiers below the seam, then the 25x divergence lives in where each query's true neighbours fall among the cells: a query-corpus relationship, which is where OVB's R107 replication located the query-side signal. If it fails there, routing on real data has a component the cell ranks miss. Either outcome is informative, and it can be registered before it is run.</w:t>
+        <w:t>Correction, 2026-09-29, same day. An earlier version of this paragraph proposed testing whether the cell-rank prediction also holds on OVB's real tiers. That is not a test: measured against the same index's full scan, recall at probe width p equals the share of reference neighbours whose cell rank is below p by construction, on any corpus, because scoring inside a probed cell is the distance the reference used (1T_RECALL_RESULT, 'Reachability'). Its exact match at 10^12 confirms the bookkeeping, not a property of the data. The empirical content is the distribution of those cell ranks, and two questions about it can be registered. First, on nested real tiers, do true neighbours sit deeper in the probe order as N grows from T6 to T7 at the same nlist rule (OVB's scale question, now on real data)? Second, which per-query stratum predicts that depth: the directions can be stated in advance (deeper for higher local intrinsic dimension, tighter margin and wider neighbour dispersion). If the 25x real-versus-synthetic divergence of R80 is a query-corpus relationship, as R107 suggests, the strata should carry it.</w:t>
       </w:r>
     </w:p>
     <w:p>
@@ -2980,7 +2980,7 @@
         <w:t>Plus:</w:t>
       </w:r>
       <w:r>
-        <w:t xml:space="preserve"> the cell-rank prediction of probe depth, registered against OVB's real tiers (section 3).</w:t>
+        <w:t xml:space="preserve"> the depth of true neighbours' cell ranks on the real tiers, T6 against T7, and by stratum, with the directions stated in advance (section 3, as corrected).</w:t>
       </w:r>
     </w:p>
     <w:p>
@@ -3155,10 +3155,7 @@
         <w:pStyle w:val="ListParagraph"/>
       </w:pPr>
       <w:r>
-        <w:t xml:space="preserve">7. </w:t>
-      </w:r>
-      <w:r>
-        <w:t xml:space="preserve"> Write the preregistration for section 4, including the cell-rank prediction on OVB's real tiers. Commit it before any run.</w:t>
+        <w:t>7.  Write the preregistration for section 4, including the cell-rank depth questions on OVB's real tiers (section 3, as corrected). Commit it before any run.</w:t>
       </w:r>
     </w:p>
     <w:p>

</xml_diff>

<commit_message>
Plan: correct the cell-rank 'testable link'; it holds by construction (#278)
Against the same index's full scan, recall at width p equals the share of
reference neighbours with cell rank below p on any corpus, so the exact match
at 10^12 is bookkeeping, not a property of the data. Replaced by the two
registrable questions about the distribution of cell ranks (depth vs N on
nested real tiers; which stratum predicts depth, directions stated first).

Co-authored-by: Claude Opus 5.5 (1M context) <noreply@anthropic.com>
</commit_message>
<xml_diff>
--- a/docs/notes/turboquant-pro_feature-requests.docx
+++ b/docs/notes/turboquant-pro_feature-requests.docx
@@ -2899,7 +2899,7 @@
     </w:p>
     <w:p>
       <w:r>
-        <w:t>The testable link between the two repos. The cell-rank prediction reproduced the 10^12 probe curve exactly, and it needs only the index and the reference neighbours' cell ranks, not a model of the corpus. If it also predicts the real corpus's probe depth on OVB's real tiers below the seam, then the 25x divergence lives in where each query's true neighbours fall among the cells: a query-corpus relationship, which is where OVB's R107 replication located the query-side signal. If it fails there, routing on real data has a component the cell ranks miss. Either outcome is informative, and it can be registered before it is run.</w:t>
+        <w:t>Correction, 2026-09-29, same day. An earlier version of this paragraph proposed testing whether the cell-rank prediction also holds on OVB's real tiers. That is not a test: measured against the same index's full scan, recall at probe width p equals the share of reference neighbours whose cell rank is below p by construction, on any corpus, because scoring inside a probed cell is the distance the reference used (1T_RECALL_RESULT, 'Reachability'). Its exact match at 10^12 confirms the bookkeeping, not a property of the data. The empirical content is the distribution of those cell ranks, and two questions about it can be registered. First, on nested real tiers, do true neighbours sit deeper in the probe order as N grows from T6 to T7 at the same nlist rule (OVB's scale question, now on real data)? Second, which per-query stratum predicts that depth: the directions can be stated in advance (deeper for higher local intrinsic dimension, tighter margin and wider neighbour dispersion). If the 25x real-versus-synthetic divergence of R80 is a query-corpus relationship, as R107 suggests, the strata should carry it.</w:t>
       </w:r>
     </w:p>
     <w:p>
@@ -2980,7 +2980,7 @@
         <w:t>Plus:</w:t>
       </w:r>
       <w:r>
-        <w:t xml:space="preserve"> the cell-rank prediction of probe depth, registered against OVB's real tiers (section 3).</w:t>
+        <w:t xml:space="preserve"> the depth of true neighbours' cell ranks on the real tiers, T6 against T7, and by stratum, with the directions stated in advance (section 3, as corrected).</w:t>
       </w:r>
     </w:p>
     <w:p>
@@ -3155,10 +3155,7 @@
         <w:pStyle w:val="ListParagraph"/>
       </w:pPr>
       <w:r>
-        <w:t xml:space="preserve">7. </w:t>
-      </w:r>
-      <w:r>
-        <w:t xml:space="preserve"> Write the preregistration for section 4, including the cell-rank prediction on OVB's real tiers. Commit it before any run.</w:t>
+        <w:t>7.  Write the preregistration for section 4, including the cell-rank depth questions on OVB's real tiers (section 3, as corrected). Commit it before any run.</w:t>
       </w:r>
     </w:p>
     <w:p>

</xml_diff>